<commit_message>
Fix paths, update homepage image, add requirements
Standardize local file paths by replacing OneDrive paths with Documents for the model and dataset (app.py, train_model.py). Move and replace the homepage image with a new Unsplash URL and caption in app.py. Add requirements.txt with pinned dependency versions. Include updated water_model.pkl and Report.docx binaries.
</commit_message>
<xml_diff>
--- a/Report.docx
+++ b/Report.docx
@@ -4,33 +4,86 @@
   <w:body>
     <w:p>
       <w:pPr>
-        <w:pStyle w:val="Title"/>
-        <w:rPr>
-          <w:b/>
-          <w:bCs/>
-        </w:rPr>
-      </w:pPr>
-      <w:r>
-        <w:rPr>
-          <w:b/>
-          <w:bCs/>
-        </w:rPr>
-        <w:t>Project Title: AquaGuard: AI-Powered Water Quality Monitoring System</w:t>
+        <w:pStyle w:val="Heading1"/>
+        <w:rPr>
+          <w:rStyle w:val="BookTitle"/>
+          <w:i w:val="0"/>
+          <w:iCs w:val="0"/>
+        </w:rPr>
+      </w:pPr>
+      <w:r>
+        <w:rPr>
+          <w:rStyle w:val="BookTitle"/>
+          <w:i w:val="0"/>
+          <w:iCs w:val="0"/>
+        </w:rPr>
+        <w:t>Project Title: AquaGuard</w:t>
+      </w:r>
+      <w:r>
+        <w:rPr>
+          <w:rStyle w:val="BookTitle"/>
+          <w:i w:val="0"/>
+          <w:iCs w:val="0"/>
+        </w:rPr>
+        <w:br/>
+      </w:r>
+      <w:r>
+        <w:rPr>
+          <w:rStyle w:val="BookTitle"/>
+          <w:i w:val="0"/>
+          <w:iCs w:val="0"/>
+        </w:rPr>
+        <w:t>AI-Powered Water Quality Monitoring System</w:t>
       </w:r>
     </w:p>
     <w:p>
       <w:pPr>
         <w:pStyle w:val="Subtitle"/>
-      </w:pPr>
-      <w:r>
+        <w:jc w:val="both"/>
+        <w:rPr>
+          <w:rStyle w:val="SubtleEmphasis"/>
+        </w:rPr>
+      </w:pPr>
+      <w:r>
+        <w:rPr>
+          <w:rStyle w:val="SubtleEmphasis"/>
+        </w:rPr>
         <w:t>Selected SDG and Reason for Selection: SDG 6 - Clean Water and Sanitation</w:t>
       </w:r>
     </w:p>
     <w:p>
-      <w:pPr>
+      <w:r>
+        <w:t>Submitted by: Hardik Kotawdekar</w:t>
+      </w:r>
+    </w:p>
+    <w:p>
+      <w:r>
+        <w:t>Date: May/2026</w:t>
+      </w:r>
+    </w:p>
+    <w:p/>
+    <w:p>
+      <w:pPr>
+        <w:pStyle w:val="ListParagraph"/>
+        <w:numPr>
+          <w:ilvl w:val="0"/>
+          <w:numId w:val="5"/>
+        </w:numPr>
         <w:jc w:val="both"/>
       </w:pPr>
       <w:r>
+        <w:rPr>
+          <w:b/>
+          <w:bCs/>
+        </w:rPr>
+        <w:t>Reason for Selection:</w:t>
+      </w:r>
+    </w:p>
+    <w:p>
+      <w:pPr>
+        <w:jc w:val="both"/>
+      </w:pPr>
+      <w:r>
         <w:t>I selected SDG 6 because access to clean drinking water is a major issue in India, especially in Mumbai and Maharashtra. Contaminated water causes millions of waterborne diseases every year. This project aims to provide an accessible AI tool for individuals and local authorities to check water quality quickly.</w:t>
       </w:r>
     </w:p>
@@ -38,6 +91,16 @@
       <w:pPr>
         <w:jc w:val="both"/>
       </w:pPr>
+    </w:p>
+    <w:p>
+      <w:pPr>
+        <w:pStyle w:val="ListParagraph"/>
+        <w:numPr>
+          <w:ilvl w:val="0"/>
+          <w:numId w:val="5"/>
+        </w:numPr>
+        <w:jc w:val="both"/>
+      </w:pPr>
       <w:r>
         <w:rPr>
           <w:b/>
@@ -46,24 +109,37 @@
         <w:t>Problem Statement:</w:t>
       </w:r>
       <w:r>
-        <w:t xml:space="preserve"> Many households, slums, and rural areas lack affordable and real-time water quality testing. People unknowingly consume contaminated water leading to diseases like </w:t>
-      </w:r>
-      <w:proofErr w:type="spellStart"/>
+        <w:t xml:space="preserve"> </w:t>
+      </w:r>
+    </w:p>
+    <w:p>
+      <w:pPr>
+        <w:jc w:val="both"/>
+      </w:pPr>
+      <w:r>
+        <w:t xml:space="preserve">Many households, slums, and rural areas lack affordable and real-time water quality testing. People unknowingly consume contaminated water leading to diseases like </w:t>
+      </w:r>
       <w:r>
         <w:t>d</w:t>
       </w:r>
       <w:r>
-        <w:t>iarrhea</w:t>
-      </w:r>
-      <w:proofErr w:type="spellEnd"/>
-      <w:r>
-        <w:t>, cholera, and typhoid. Traditional lab testing is expensive and slow. There is no easy-to-use system for citizens to check water safety instantly.</w:t>
+        <w:t>iarrhea, cholera, and typhoid. Traditional lab testing is expensive and slow. There is no easy-to-use system for citizens to check water safety instantly.</w:t>
       </w:r>
     </w:p>
     <w:p>
       <w:pPr>
         <w:jc w:val="both"/>
       </w:pPr>
+    </w:p>
+    <w:p>
+      <w:pPr>
+        <w:pStyle w:val="ListParagraph"/>
+        <w:numPr>
+          <w:ilvl w:val="0"/>
+          <w:numId w:val="5"/>
+        </w:numPr>
+        <w:jc w:val="both"/>
+      </w:pPr>
       <w:r>
         <w:rPr>
           <w:b/>
@@ -71,15 +147,30 @@
         </w:rPr>
         <w:t>Project Objective:</w:t>
       </w:r>
-      <w:r>
-        <w:t xml:space="preserve"> To develop an AI-based web application that predicts whether water is potable or not using machine learning, helping users make informed decisions about water consumption.</w:t>
-      </w:r>
     </w:p>
     <w:p>
       <w:pPr>
         <w:jc w:val="both"/>
       </w:pPr>
       <w:r>
+        <w:t>To develop an AI-based web application that predicts whether water is potable or not using machine learning, helping users make informed decisions about water consumption.</w:t>
+      </w:r>
+    </w:p>
+    <w:p>
+      <w:pPr>
+        <w:jc w:val="both"/>
+      </w:pPr>
+    </w:p>
+    <w:p>
+      <w:pPr>
+        <w:pStyle w:val="ListParagraph"/>
+        <w:numPr>
+          <w:ilvl w:val="0"/>
+          <w:numId w:val="5"/>
+        </w:numPr>
+        <w:jc w:val="both"/>
+      </w:pPr>
+      <w:r>
         <w:rPr>
           <w:b/>
           <w:bCs/>
@@ -87,7 +178,13 @@
         <w:t>Proposed Solution:</w:t>
       </w:r>
       <w:r>
-        <w:t xml:space="preserve"> AquaGuard is a Streamlit-based web application that allows users to:</w:t>
+        <w:t xml:space="preserve"> </w:t>
+      </w:r>
+      <w:r>
+        <w:t xml:space="preserve"> </w:t>
+      </w:r>
+      <w:r>
+        <w:t>AquaGuard is a Streamlit-based web application that allows users to:</w:t>
       </w:r>
     </w:p>
     <w:p>
@@ -142,24 +239,117 @@
       <w:pPr>
         <w:jc w:val="both"/>
       </w:pPr>
-      <w:r>
-        <w:rPr>
-          <w:b/>
-          <w:bCs/>
-        </w:rPr>
-        <w:t>How the System Works:</w:t>
-      </w:r>
-      <w:r>
-        <w:t xml:space="preserve"> The system uses Random Forest Classifier trained on water quality dataset to predict potability. It </w:t>
-      </w:r>
-      <w:r>
-        <w:t>analyses</w:t>
-      </w:r>
-      <w:r>
-        <w:t xml:space="preserve"> 9 key parameters (pH, Turbidity, Hardness, etc.).</w:t>
-      </w:r>
-    </w:p>
-    <w:p>
+    </w:p>
+    <w:p>
+      <w:pPr>
+        <w:pStyle w:val="ListParagraph"/>
+        <w:numPr>
+          <w:ilvl w:val="0"/>
+          <w:numId w:val="5"/>
+        </w:numPr>
+      </w:pPr>
+      <w:r>
+        <w:rPr>
+          <w:b/>
+          <w:bCs/>
+        </w:rPr>
+        <w:t>How the system works:</w:t>
+      </w:r>
+    </w:p>
+    <w:p>
+      <w:pPr>
+        <w:pStyle w:val="ListParagraph"/>
+        <w:numPr>
+          <w:ilvl w:val="0"/>
+          <w:numId w:val="1"/>
+        </w:numPr>
+      </w:pPr>
+      <w:r>
+        <w:t>- Users input water parameters (pH, Turbidity, Hardness, etc.) via interactive sliders.  </w:t>
+      </w:r>
+    </w:p>
+    <w:p>
+      <w:pPr>
+        <w:pStyle w:val="ListParagraph"/>
+        <w:numPr>
+          <w:ilvl w:val="0"/>
+          <w:numId w:val="1"/>
+        </w:numPr>
+      </w:pPr>
+      <w:r>
+        <w:t>- The trained Random Forest model processes the input and predicts if the water is</w:t>
+      </w:r>
+    </w:p>
+    <w:p>
+      <w:pPr>
+        <w:pStyle w:val="ListParagraph"/>
+      </w:pPr>
+      <w:r>
+        <w:rPr>
+          <w:b/>
+          <w:bCs/>
+        </w:rPr>
+        <w:t>Safe</w:t>
+      </w:r>
+      <w:r>
+        <w:t xml:space="preserve"> or </w:t>
+      </w:r>
+      <w:r>
+        <w:rPr>
+          <w:b/>
+          <w:bCs/>
+        </w:rPr>
+        <w:t>Unsafe</w:t>
+      </w:r>
+      <w:r>
+        <w:t>.  </w:t>
+      </w:r>
+    </w:p>
+    <w:p>
+      <w:pPr>
+        <w:pStyle w:val="ListParagraph"/>
+        <w:numPr>
+          <w:ilvl w:val="0"/>
+          <w:numId w:val="1"/>
+        </w:numPr>
+      </w:pPr>
+      <w:r>
+        <w:t>- It also displays a confidence score.  </w:t>
+      </w:r>
+    </w:p>
+    <w:p>
+      <w:pPr>
+        <w:pStyle w:val="ListParagraph"/>
+        <w:numPr>
+          <w:ilvl w:val="0"/>
+          <w:numId w:val="1"/>
+        </w:numPr>
+      </w:pPr>
+      <w:r>
+        <w:t>- Includes an image upload module (prepared for future CNN integration).  </w:t>
+      </w:r>
+    </w:p>
+    <w:p>
+      <w:pPr>
+        <w:pStyle w:val="ListParagraph"/>
+        <w:numPr>
+          <w:ilvl w:val="0"/>
+          <w:numId w:val="1"/>
+        </w:numPr>
+      </w:pPr>
+      <w:r>
+        <w:t>- Features a visual dashboard for insights.</w:t>
+      </w:r>
+    </w:p>
+    <w:p/>
+    <w:p>
+      <w:pPr>
+        <w:pStyle w:val="ListParagraph"/>
+        <w:numPr>
+          <w:ilvl w:val="0"/>
+          <w:numId w:val="5"/>
+        </w:numPr>
+      </w:pPr>
       <w:r>
         <w:rPr>
           <w:b/>
@@ -223,61 +413,703 @@
         <w:t>Clean and user-friendly interface</w:t>
       </w:r>
     </w:p>
-    <w:p>
-      <w:r>
-        <w:rPr>
-          <w:b/>
-          <w:bCs/>
-        </w:rPr>
-        <w:t>Technology Stack:</w:t>
-      </w:r>
-    </w:p>
-    <w:p>
-      <w:pPr>
+    <w:p/>
+    <w:p>
+      <w:pPr>
+        <w:pStyle w:val="ListParagraph"/>
         <w:numPr>
           <w:ilvl w:val="0"/>
-          <w:numId w:val="3"/>
+          <w:numId w:val="5"/>
         </w:numPr>
-      </w:pPr>
-      <w:r>
-        <w:t>Python</w:t>
-      </w:r>
-    </w:p>
-    <w:p>
-      <w:pPr>
+        <w:rPr>
+          <w:b/>
+          <w:bCs/>
+        </w:rPr>
+      </w:pPr>
+      <w:r>
+        <w:rPr>
+          <w:b/>
+          <w:bCs/>
+        </w:rPr>
+        <w:t>Technology Stack</w:t>
+      </w:r>
+    </w:p>
+    <w:p>
+      <w:pPr>
+        <w:pStyle w:val="ListParagraph"/>
         <w:numPr>
           <w:ilvl w:val="0"/>
-          <w:numId w:val="3"/>
+          <w:numId w:val="7"/>
         </w:numPr>
       </w:pPr>
       <w:r>
-        <w:lastRenderedPageBreak/>
-        <w:t>Scikit-learn (Random Forest)</w:t>
-      </w:r>
-    </w:p>
-    <w:p>
-      <w:pPr>
+        <w:rPr>
+          <w:b/>
+          <w:bCs/>
+        </w:rPr>
+        <w:t>Programming Language:</w:t>
+      </w:r>
+      <w:r>
+        <w:t xml:space="preserve"> Python  </w:t>
+      </w:r>
+    </w:p>
+    <w:p>
+      <w:pPr>
+        <w:pStyle w:val="ListParagraph"/>
         <w:numPr>
           <w:ilvl w:val="0"/>
-          <w:numId w:val="3"/>
+          <w:numId w:val="7"/>
         </w:numPr>
       </w:pPr>
       <w:r>
-        <w:t>Streamlit (Web Interface)</w:t>
-      </w:r>
-    </w:p>
-    <w:p>
-      <w:pPr>
+        <w:rPr>
+          <w:b/>
+          <w:bCs/>
+        </w:rPr>
+        <w:t>Machine Learning:</w:t>
+      </w:r>
+      <w:r>
+        <w:t xml:space="preserve"> Scikit-learn (Random Forest Classifier)  </w:t>
+      </w:r>
+    </w:p>
+    <w:p>
+      <w:pPr>
+        <w:pStyle w:val="ListParagraph"/>
         <w:numPr>
           <w:ilvl w:val="0"/>
-          <w:numId w:val="3"/>
+          <w:numId w:val="7"/>
         </w:numPr>
       </w:pPr>
       <w:r>
-        <w:t>Pandas, NumPy, Joblib, Plotly</w:t>
-      </w:r>
-    </w:p>
-    <w:p>
+        <w:rPr>
+          <w:b/>
+          <w:bCs/>
+        </w:rPr>
+        <w:t>Web Framework:</w:t>
+      </w:r>
+      <w:r>
+        <w:rPr>
+          <w:b/>
+          <w:bCs/>
+        </w:rPr>
+        <w:t xml:space="preserve"> </w:t>
+      </w:r>
+      <w:r>
+        <w:t>Streamlit  </w:t>
+      </w:r>
+    </w:p>
+    <w:p>
+      <w:pPr>
+        <w:pStyle w:val="ListParagraph"/>
+        <w:numPr>
+          <w:ilvl w:val="0"/>
+          <w:numId w:val="7"/>
+        </w:numPr>
+      </w:pPr>
+      <w:r>
+        <w:rPr>
+          <w:b/>
+          <w:bCs/>
+        </w:rPr>
+        <w:t>Data Processing:</w:t>
+      </w:r>
+      <w:r>
+        <w:t xml:space="preserve"> Pandas, NumPy  </w:t>
+      </w:r>
+    </w:p>
+    <w:p>
+      <w:pPr>
+        <w:pStyle w:val="ListParagraph"/>
+        <w:numPr>
+          <w:ilvl w:val="0"/>
+          <w:numId w:val="7"/>
+        </w:numPr>
+      </w:pPr>
+      <w:r>
+        <w:rPr>
+          <w:b/>
+          <w:bCs/>
+        </w:rPr>
+        <w:t>Model Persistence:</w:t>
+      </w:r>
+      <w:r>
+        <w:rPr>
+          <w:b/>
+          <w:bCs/>
+        </w:rPr>
+        <w:t xml:space="preserve"> </w:t>
+      </w:r>
+      <w:r>
+        <w:t>Joblib  </w:t>
+      </w:r>
+    </w:p>
+    <w:p>
+      <w:pPr>
+        <w:pStyle w:val="ListParagraph"/>
+        <w:numPr>
+          <w:ilvl w:val="0"/>
+          <w:numId w:val="7"/>
+        </w:numPr>
+      </w:pPr>
+      <w:r>
+        <w:rPr>
+          <w:b/>
+          <w:bCs/>
+        </w:rPr>
+        <w:t>Visualization:</w:t>
+      </w:r>
+      <w:r>
+        <w:t xml:space="preserve"> Plotly  </w:t>
+      </w:r>
+    </w:p>
+    <w:p/>
+    <w:p>
+      <w:pPr>
+        <w:rPr>
+          <w:rStyle w:val="Strong"/>
+        </w:rPr>
+      </w:pPr>
+    </w:p>
+    <w:p>
+      <w:pPr>
+        <w:rPr>
+          <w:rStyle w:val="Strong"/>
+        </w:rPr>
+      </w:pPr>
+      <w:r>
+        <w:rPr>
+          <w:rStyle w:val="Strong"/>
+        </w:rPr>
+        <w:br w:type="page"/>
+      </w:r>
+    </w:p>
+    <w:p>
+      <w:pPr>
+        <w:rPr>
+          <w:b/>
+          <w:bCs/>
+        </w:rPr>
+      </w:pPr>
+      <w:r>
+        <w:rPr>
+          <w:rStyle w:val="Strong"/>
+        </w:rPr>
+        <w:lastRenderedPageBreak/>
+        <w:t>Screenshots:</w:t>
+      </w:r>
+    </w:p>
+    <w:p>
+      <w:pPr>
+        <w:jc w:val="center"/>
+        <w:rPr>
+          <w:b/>
+          <w:bCs/>
+        </w:rPr>
+      </w:pPr>
+      <w:r>
+        <w:drawing>
+          <wp:anchor distT="0" distB="0" distL="114300" distR="114300" simplePos="0" relativeHeight="251658240" behindDoc="0" locked="0" layoutInCell="1" allowOverlap="1" wp14:anchorId="1D32CCC3" wp14:editId="1021EC3C">
+            <wp:simplePos x="0" y="0"/>
+            <wp:positionH relativeFrom="margin">
+              <wp:align>center</wp:align>
+            </wp:positionH>
+            <wp:positionV relativeFrom="page">
+              <wp:posOffset>1544864</wp:posOffset>
+            </wp:positionV>
+            <wp:extent cx="5731510" cy="2743835"/>
+            <wp:effectExtent l="0" t="0" r="2540" b="0"/>
+            <wp:wrapTopAndBottom/>
+            <wp:docPr id="1403010865" name="Picture 1"/>
+            <wp:cNvGraphicFramePr>
+              <a:graphicFrameLocks xmlns:a="http://schemas.openxmlformats.org/drawingml/2006/main" noChangeAspect="1"/>
+            </wp:cNvGraphicFramePr>
+            <a:graphic xmlns:a="http://schemas.openxmlformats.org/drawingml/2006/main">
+              <a:graphicData uri="http://schemas.openxmlformats.org/drawingml/2006/picture">
+                <pic:pic xmlns:pic="http://schemas.openxmlformats.org/drawingml/2006/picture">
+                  <pic:nvPicPr>
+                    <pic:cNvPr id="1403010865" name=""/>
+                    <pic:cNvPicPr/>
+                  </pic:nvPicPr>
+                  <pic:blipFill>
+                    <a:blip r:embed="rId5" cstate="print">
+                      <a:extLst>
+                        <a:ext uri="{28A0092B-C50C-407E-A947-70E740481C1C}">
+                          <a14:useLocalDpi xmlns:a14="http://schemas.microsoft.com/office/drawing/2010/main" val="0"/>
+                        </a:ext>
+                      </a:extLst>
+                    </a:blip>
+                    <a:stretch>
+                      <a:fillRect/>
+                    </a:stretch>
+                  </pic:blipFill>
+                  <pic:spPr>
+                    <a:xfrm>
+                      <a:off x="0" y="0"/>
+                      <a:ext cx="5731510" cy="2743835"/>
+                    </a:xfrm>
+                    <a:prstGeom prst="rect">
+                      <a:avLst/>
+                    </a:prstGeom>
+                  </pic:spPr>
+                </pic:pic>
+              </a:graphicData>
+            </a:graphic>
+          </wp:anchor>
+        </w:drawing>
+      </w:r>
+    </w:p>
+    <w:p>
+      <w:pPr>
+        <w:jc w:val="center"/>
+        <w:rPr>
+          <w:b/>
+          <w:bCs/>
+        </w:rPr>
+      </w:pPr>
+      <w:r>
+        <w:rPr>
+          <w:b/>
+          <w:bCs/>
+        </w:rPr>
+        <w:t>Homepage</w:t>
+      </w:r>
+      <w:r>
+        <w:rPr>
+          <w:b/>
+          <w:bCs/>
+        </w:rPr>
+        <w:br/>
+      </w:r>
+      <w:r>
+        <w:rPr>
+          <w:b/>
+          <w:bCs/>
+        </w:rPr>
+        <w:br/>
+      </w:r>
+    </w:p>
+    <w:p>
+      <w:pPr>
+        <w:rPr>
+          <w:b/>
+          <w:bCs/>
+        </w:rPr>
+      </w:pPr>
+      <w:r>
+        <w:rPr>
+          <w:b/>
+          <w:bCs/>
+        </w:rPr>
+        <w:drawing>
+          <wp:anchor distT="0" distB="0" distL="114300" distR="114300" simplePos="0" relativeHeight="251659264" behindDoc="0" locked="0" layoutInCell="1" allowOverlap="1" wp14:anchorId="47296FED" wp14:editId="29F43BF4">
+            <wp:simplePos x="0" y="0"/>
+            <wp:positionH relativeFrom="margin">
+              <wp:align>right</wp:align>
+            </wp:positionH>
+            <wp:positionV relativeFrom="page">
+              <wp:posOffset>5375910</wp:posOffset>
+            </wp:positionV>
+            <wp:extent cx="5731510" cy="2743835"/>
+            <wp:effectExtent l="0" t="0" r="2540" b="0"/>
+            <wp:wrapTopAndBottom/>
+            <wp:docPr id="1037290398" name="Picture 1"/>
+            <wp:cNvGraphicFramePr>
+              <a:graphicFrameLocks xmlns:a="http://schemas.openxmlformats.org/drawingml/2006/main" noChangeAspect="1"/>
+            </wp:cNvGraphicFramePr>
+            <a:graphic xmlns:a="http://schemas.openxmlformats.org/drawingml/2006/main">
+              <a:graphicData uri="http://schemas.openxmlformats.org/drawingml/2006/picture">
+                <pic:pic xmlns:pic="http://schemas.openxmlformats.org/drawingml/2006/picture">
+                  <pic:nvPicPr>
+                    <pic:cNvPr id="1037290398" name=""/>
+                    <pic:cNvPicPr/>
+                  </pic:nvPicPr>
+                  <pic:blipFill>
+                    <a:blip r:embed="rId6" cstate="print">
+                      <a:extLst>
+                        <a:ext uri="{28A0092B-C50C-407E-A947-70E740481C1C}">
+                          <a14:useLocalDpi xmlns:a14="http://schemas.microsoft.com/office/drawing/2010/main" val="0"/>
+                        </a:ext>
+                      </a:extLst>
+                    </a:blip>
+                    <a:stretch>
+                      <a:fillRect/>
+                    </a:stretch>
+                  </pic:blipFill>
+                  <pic:spPr>
+                    <a:xfrm>
+                      <a:off x="0" y="0"/>
+                      <a:ext cx="5731510" cy="2743835"/>
+                    </a:xfrm>
+                    <a:prstGeom prst="rect">
+                      <a:avLst/>
+                    </a:prstGeom>
+                  </pic:spPr>
+                </pic:pic>
+              </a:graphicData>
+            </a:graphic>
+          </wp:anchor>
+        </w:drawing>
+      </w:r>
+    </w:p>
+    <w:p>
+      <w:pPr>
+        <w:jc w:val="center"/>
+        <w:rPr>
+          <w:b/>
+          <w:bCs/>
+        </w:rPr>
+      </w:pPr>
+      <w:r>
+        <w:rPr>
+          <w:b/>
+          <w:bCs/>
+        </w:rPr>
+        <w:t>Parameter input page</w:t>
+      </w:r>
+    </w:p>
+    <w:p>
+      <w:pPr>
+        <w:jc w:val="center"/>
+        <w:rPr>
+          <w:b/>
+          <w:bCs/>
+        </w:rPr>
+      </w:pPr>
+    </w:p>
+    <w:p>
+      <w:pPr>
+        <w:jc w:val="center"/>
+        <w:rPr>
+          <w:b/>
+          <w:bCs/>
+        </w:rPr>
+      </w:pPr>
+    </w:p>
+    <w:p>
+      <w:pPr>
+        <w:jc w:val="center"/>
+        <w:rPr>
+          <w:b/>
+          <w:bCs/>
+        </w:rPr>
+      </w:pPr>
+    </w:p>
+    <w:p>
+      <w:pPr>
+        <w:jc w:val="center"/>
+        <w:rPr>
+          <w:b/>
+          <w:bCs/>
+        </w:rPr>
+      </w:pPr>
+    </w:p>
+    <w:p>
+      <w:pPr>
+        <w:jc w:val="center"/>
+        <w:rPr>
+          <w:b/>
+          <w:bCs/>
+        </w:rPr>
+      </w:pPr>
+      <w:r>
+        <w:rPr>
+          <w:b/>
+          <w:bCs/>
+        </w:rPr>
+        <w:lastRenderedPageBreak/>
+        <w:drawing>
+          <wp:anchor distT="0" distB="0" distL="114300" distR="114300" simplePos="0" relativeHeight="251660288" behindDoc="0" locked="0" layoutInCell="1" allowOverlap="1" wp14:anchorId="767F3C4E" wp14:editId="7B309D62">
+            <wp:simplePos x="0" y="0"/>
+            <wp:positionH relativeFrom="margin">
+              <wp:align>center</wp:align>
+            </wp:positionH>
+            <wp:positionV relativeFrom="margin">
+              <wp:align>top</wp:align>
+            </wp:positionV>
+            <wp:extent cx="5731510" cy="2743835"/>
+            <wp:effectExtent l="0" t="0" r="2540" b="0"/>
+            <wp:wrapTopAndBottom/>
+            <wp:docPr id="1969117138" name="Picture 1"/>
+            <wp:cNvGraphicFramePr>
+              <a:graphicFrameLocks xmlns:a="http://schemas.openxmlformats.org/drawingml/2006/main" noChangeAspect="1"/>
+            </wp:cNvGraphicFramePr>
+            <a:graphic xmlns:a="http://schemas.openxmlformats.org/drawingml/2006/main">
+              <a:graphicData uri="http://schemas.openxmlformats.org/drawingml/2006/picture">
+                <pic:pic xmlns:pic="http://schemas.openxmlformats.org/drawingml/2006/picture">
+                  <pic:nvPicPr>
+                    <pic:cNvPr id="1969117138" name=""/>
+                    <pic:cNvPicPr/>
+                  </pic:nvPicPr>
+                  <pic:blipFill>
+                    <a:blip r:embed="rId7" cstate="print">
+                      <a:extLst>
+                        <a:ext uri="{28A0092B-C50C-407E-A947-70E740481C1C}">
+                          <a14:useLocalDpi xmlns:a14="http://schemas.microsoft.com/office/drawing/2010/main" val="0"/>
+                        </a:ext>
+                      </a:extLst>
+                    </a:blip>
+                    <a:stretch>
+                      <a:fillRect/>
+                    </a:stretch>
+                  </pic:blipFill>
+                  <pic:spPr>
+                    <a:xfrm>
+                      <a:off x="0" y="0"/>
+                      <a:ext cx="5731510" cy="2743835"/>
+                    </a:xfrm>
+                    <a:prstGeom prst="rect">
+                      <a:avLst/>
+                    </a:prstGeom>
+                  </pic:spPr>
+                </pic:pic>
+              </a:graphicData>
+            </a:graphic>
+          </wp:anchor>
+        </w:drawing>
+      </w:r>
+      <w:r>
+        <w:rPr>
+          <w:b/>
+          <w:bCs/>
+        </w:rPr>
+        <w:t>Image upload demo</w:t>
+      </w:r>
+    </w:p>
+    <w:p>
+      <w:pPr>
+        <w:jc w:val="center"/>
+        <w:rPr>
+          <w:b/>
+          <w:bCs/>
+        </w:rPr>
+      </w:pPr>
+      <w:r>
+        <w:rPr>
+          <w:b/>
+          <w:bCs/>
+        </w:rPr>
+        <w:t xml:space="preserve"> </w:t>
+      </w:r>
+    </w:p>
+    <w:p>
+      <w:pPr>
+        <w:jc w:val="center"/>
+        <w:rPr>
+          <w:b/>
+          <w:bCs/>
+        </w:rPr>
+      </w:pPr>
+    </w:p>
+    <w:p>
+      <w:pPr>
+        <w:jc w:val="center"/>
+        <w:rPr>
+          <w:b/>
+          <w:bCs/>
+        </w:rPr>
+      </w:pPr>
+    </w:p>
+    <w:p>
+      <w:pPr>
+        <w:jc w:val="center"/>
+        <w:rPr>
+          <w:b/>
+          <w:bCs/>
+        </w:rPr>
+      </w:pPr>
+      <w:r>
+        <w:rPr>
+          <w:b/>
+          <w:bCs/>
+        </w:rPr>
+        <w:drawing>
+          <wp:anchor distT="0" distB="0" distL="114300" distR="114300" simplePos="0" relativeHeight="251661312" behindDoc="0" locked="0" layoutInCell="1" allowOverlap="1" wp14:anchorId="53512F66" wp14:editId="468E03E8">
+            <wp:simplePos x="0" y="0"/>
+            <wp:positionH relativeFrom="margin">
+              <wp:align>center</wp:align>
+            </wp:positionH>
+            <wp:positionV relativeFrom="page">
+              <wp:posOffset>4937669</wp:posOffset>
+            </wp:positionV>
+            <wp:extent cx="5731510" cy="2743835"/>
+            <wp:effectExtent l="0" t="0" r="2540" b="0"/>
+            <wp:wrapTopAndBottom/>
+            <wp:docPr id="1884125308" name="Picture 1"/>
+            <wp:cNvGraphicFramePr>
+              <a:graphicFrameLocks xmlns:a="http://schemas.openxmlformats.org/drawingml/2006/main" noChangeAspect="1"/>
+            </wp:cNvGraphicFramePr>
+            <a:graphic xmlns:a="http://schemas.openxmlformats.org/drawingml/2006/main">
+              <a:graphicData uri="http://schemas.openxmlformats.org/drawingml/2006/picture">
+                <pic:pic xmlns:pic="http://schemas.openxmlformats.org/drawingml/2006/picture">
+                  <pic:nvPicPr>
+                    <pic:cNvPr id="1884125308" name=""/>
+                    <pic:cNvPicPr/>
+                  </pic:nvPicPr>
+                  <pic:blipFill>
+                    <a:blip r:embed="rId8" cstate="print">
+                      <a:extLst>
+                        <a:ext uri="{28A0092B-C50C-407E-A947-70E740481C1C}">
+                          <a14:useLocalDpi xmlns:a14="http://schemas.microsoft.com/office/drawing/2010/main" val="0"/>
+                        </a:ext>
+                      </a:extLst>
+                    </a:blip>
+                    <a:stretch>
+                      <a:fillRect/>
+                    </a:stretch>
+                  </pic:blipFill>
+                  <pic:spPr>
+                    <a:xfrm>
+                      <a:off x="0" y="0"/>
+                      <a:ext cx="5731510" cy="2743835"/>
+                    </a:xfrm>
+                    <a:prstGeom prst="rect">
+                      <a:avLst/>
+                    </a:prstGeom>
+                  </pic:spPr>
+                </pic:pic>
+              </a:graphicData>
+            </a:graphic>
+          </wp:anchor>
+        </w:drawing>
+      </w:r>
+      <w:r>
+        <w:rPr>
+          <w:b/>
+          <w:bCs/>
+        </w:rPr>
+        <w:t>Dashboard view</w:t>
+      </w:r>
+    </w:p>
+    <w:p>
+      <w:pPr>
+        <w:jc w:val="center"/>
+        <w:rPr>
+          <w:b/>
+          <w:bCs/>
+        </w:rPr>
+      </w:pPr>
+    </w:p>
+    <w:p>
+      <w:pPr>
+        <w:jc w:val="center"/>
+        <w:rPr>
+          <w:b/>
+          <w:bCs/>
+        </w:rPr>
+      </w:pPr>
+    </w:p>
+    <w:p>
+      <w:pPr>
+        <w:jc w:val="center"/>
+        <w:rPr>
+          <w:b/>
+          <w:bCs/>
+        </w:rPr>
+      </w:pPr>
+    </w:p>
+    <w:p>
+      <w:pPr>
+        <w:rPr>
+          <w:b/>
+          <w:bCs/>
+        </w:rPr>
+      </w:pPr>
+      <w:r>
+        <w:rPr>
+          <w:b/>
+          <w:bCs/>
+        </w:rPr>
+        <w:br w:type="page"/>
+      </w:r>
+    </w:p>
+    <w:p>
+      <w:pPr>
+        <w:jc w:val="center"/>
+        <w:rPr>
+          <w:b/>
+          <w:bCs/>
+        </w:rPr>
+      </w:pPr>
+      <w:r>
+        <w:rPr>
+          <w:b/>
+          <w:bCs/>
+          <w:noProof/>
+        </w:rPr>
+        <w:lastRenderedPageBreak/>
+        <w:drawing>
+          <wp:anchor distT="0" distB="0" distL="114300" distR="114300" simplePos="0" relativeHeight="251662336" behindDoc="0" locked="0" layoutInCell="1" allowOverlap="1" wp14:anchorId="3DE72422" wp14:editId="3DABFC5B">
+            <wp:simplePos x="0" y="0"/>
+            <wp:positionH relativeFrom="margin">
+              <wp:align>right</wp:align>
+            </wp:positionH>
+            <wp:positionV relativeFrom="margin">
+              <wp:align>top</wp:align>
+            </wp:positionV>
+            <wp:extent cx="5731510" cy="2743835"/>
+            <wp:effectExtent l="0" t="0" r="2540" b="0"/>
+            <wp:wrapTopAndBottom/>
+            <wp:docPr id="1388637256" name="Picture 1"/>
+            <wp:cNvGraphicFramePr>
+              <a:graphicFrameLocks xmlns:a="http://schemas.openxmlformats.org/drawingml/2006/main" noChangeAspect="1"/>
+            </wp:cNvGraphicFramePr>
+            <a:graphic xmlns:a="http://schemas.openxmlformats.org/drawingml/2006/main">
+              <a:graphicData uri="http://schemas.openxmlformats.org/drawingml/2006/picture">
+                <pic:pic xmlns:pic="http://schemas.openxmlformats.org/drawingml/2006/picture">
+                  <pic:nvPicPr>
+                    <pic:cNvPr id="1388637256" name=""/>
+                    <pic:cNvPicPr/>
+                  </pic:nvPicPr>
+                  <pic:blipFill>
+                    <a:blip r:embed="rId9" cstate="print">
+                      <a:extLst>
+                        <a:ext uri="{28A0092B-C50C-407E-A947-70E740481C1C}">
+                          <a14:useLocalDpi xmlns:a14="http://schemas.microsoft.com/office/drawing/2010/main" val="0"/>
+                        </a:ext>
+                      </a:extLst>
+                    </a:blip>
+                    <a:stretch>
+                      <a:fillRect/>
+                    </a:stretch>
+                  </pic:blipFill>
+                  <pic:spPr>
+                    <a:xfrm>
+                      <a:off x="0" y="0"/>
+                      <a:ext cx="5731510" cy="2743835"/>
+                    </a:xfrm>
+                    <a:prstGeom prst="rect">
+                      <a:avLst/>
+                    </a:prstGeom>
+                  </pic:spPr>
+                </pic:pic>
+              </a:graphicData>
+            </a:graphic>
+          </wp:anchor>
+        </w:drawing>
+      </w:r>
+      <w:r>
+        <w:rPr>
+          <w:b/>
+          <w:bCs/>
+        </w:rPr>
+        <w:t>Unsafe Water Prediction Result</w:t>
+      </w:r>
+    </w:p>
+    <w:p>
+      <w:pPr>
+        <w:rPr>
+          <w:b/>
+          <w:bCs/>
+        </w:rPr>
+      </w:pPr>
+    </w:p>
+    <w:p>
+      <w:pPr>
+        <w:rPr>
+          <w:b/>
+          <w:bCs/>
+        </w:rPr>
+      </w:pPr>
       <w:r>
         <w:rPr>
           <w:b/>
@@ -341,7 +1173,47 @@
         <w:t>Expand to predict specific contaminants</w:t>
       </w:r>
     </w:p>
-    <w:p/>
+    <w:p>
+      <w:pPr>
+        <w:rPr>
+          <w:b/>
+          <w:bCs/>
+        </w:rPr>
+      </w:pPr>
+    </w:p>
+    <w:p>
+      <w:pPr>
+        <w:rPr>
+          <w:b/>
+          <w:bCs/>
+        </w:rPr>
+      </w:pPr>
+      <w:r>
+        <w:rPr>
+          <w:b/>
+          <w:bCs/>
+        </w:rPr>
+        <w:t xml:space="preserve">GitHub repo link: </w:t>
+      </w:r>
+      <w:hyperlink r:id="rId10" w:history="1">
+        <w:r>
+          <w:rPr>
+            <w:rStyle w:val="Hyperlink"/>
+            <w:b/>
+            <w:bCs/>
+          </w:rPr>
+          <w:t>Hardyik/AquaGuard</w:t>
+        </w:r>
+      </w:hyperlink>
+    </w:p>
+    <w:p>
+      <w:pPr>
+        <w:rPr>
+          <w:b/>
+          <w:bCs/>
+        </w:rPr>
+      </w:pPr>
+    </w:p>
     <w:sectPr>
       <w:pgSz w:w="11906" w:h="16838"/>
       <w:pgMar w:top="1440" w:right="1440" w:bottom="1440" w:left="1440" w:header="720" w:footer="720" w:gutter="0"/>
@@ -355,6 +1227,96 @@
 <file path=word/numbering.xml><?xml version="1.0" encoding="utf-8"?>
 <w:numbering xmlns:wpc="http://schemas.microsoft.com/office/word/2010/wordprocessingCanvas" xmlns:cx="http://schemas.microsoft.com/office/drawing/2014/chartex" xmlns:cx1="http://schemas.microsoft.com/office/drawing/2015/9/8/chartex" xmlns:cx2="http://schemas.microsoft.com/office/drawing/2015/10/21/chartex" xmlns:cx3="http://schemas.microsoft.com/office/drawing/2016/5/9/chartex" xmlns:cx4="http://schemas.microsoft.com/office/drawing/2016/5/10/chartex" xmlns:cx5="http://schemas.microsoft.com/office/drawing/2016/5/11/chartex" xmlns:cx6="http://schemas.microsoft.com/office/drawing/2016/5/12/chartex" xmlns:cx7="http://schemas.microsoft.com/office/drawing/2016/5/13/chartex" xmlns:cx8="http://schemas.microsoft.com/office/drawing/2016/5/14/chartex" xmlns:mc="http://schemas.openxmlformats.org/markup-compatibility/2006" xmlns:aink="http://schemas.microsoft.com/office/drawing/2016/ink" xmlns:am3d="http://schemas.microsoft.com/office/drawing/2017/model3d" xmlns:o="urn:schemas-microsoft-com:office:office" xmlns:oel="http://schemas.microsoft.com/office/2019/extlst" xmlns:r="http://schemas.openxmlformats.org/officeDocument/2006/relationships" xmlns:m="http://schemas.openxmlformats.org/officeDocument/2006/math" xmlns:v="urn:schemas-microsoft-com:vml" xmlns:wp14="http://schemas.microsoft.com/office/word/2010/wordprocessingDrawing" xmlns:wp="http://schemas.openxmlformats.org/drawingml/2006/wordprocessingDrawing" xmlns:w10="urn:schemas-microsoft-com:office:word" xmlns:w="http://schemas.openxmlformats.org/wordprocessingml/2006/main" xmlns:w14="http://schemas.microsoft.com/office/word/2010/wordml" xmlns:w15="http://schemas.microsoft.com/office/word/2012/wordml" xmlns:w16cex="http://schemas.microsoft.com/office/word/2018/wordml/cex" xmlns:w16cid="http://schemas.microsoft.com/office/word/2016/wordml/cid" xmlns:w16="http://schemas.microsoft.com/office/word/2018/wordml" xmlns:w16du="http://schemas.microsoft.com/office/word/2023/wordml/word16du" xmlns:w16sdtdh="http://schemas.microsoft.com/office/word/2020/wordml/sdtdatahash" xmlns:w16sdtfl="http://schemas.microsoft.com/office/word/2024/wordml/sdtformatlock" xmlns:w16se="http://schemas.microsoft.com/office/word/2015/wordml/symex" xmlns:wpg="http://schemas.microsoft.com/office/word/2010/wordprocessingGroup" xmlns:wpi="http://schemas.microsoft.com/office/word/2010/wordprocessingInk" xmlns:wne="http://schemas.microsoft.com/office/word/2006/wordml" xmlns:wps="http://schemas.microsoft.com/office/word/2010/wordprocessingShape" mc:Ignorable="w14 w15 w16se w16cid w16 w16cex w16sdtdh w16sdtfl w16du wp14">
   <w:abstractNum w:abstractNumId="0" w15:restartNumberingAfterBreak="0">
+    <w:nsid w:val="02F06FE4"/>
+    <w:multiLevelType w:val="hybridMultilevel"/>
+    <w:tmpl w:val="1A4E61E6"/>
+    <w:lvl w:ilvl="0" w:tplc="49303134">
+      <w:start w:val="1"/>
+      <w:numFmt w:val="decimal"/>
+      <w:lvlText w:val="%1."/>
+      <w:lvlJc w:val="left"/>
+      <w:pPr>
+        <w:ind w:left="720" w:hanging="360"/>
+      </w:pPr>
+      <w:rPr>
+        <w:rFonts w:hint="default"/>
+        <w:b/>
+      </w:rPr>
+    </w:lvl>
+    <w:lvl w:ilvl="1" w:tplc="40090019" w:tentative="1">
+      <w:start w:val="1"/>
+      <w:numFmt w:val="lowerLetter"/>
+      <w:lvlText w:val="%2."/>
+      <w:lvlJc w:val="left"/>
+      <w:pPr>
+        <w:ind w:left="1440" w:hanging="360"/>
+      </w:pPr>
+    </w:lvl>
+    <w:lvl w:ilvl="2" w:tplc="4009001B" w:tentative="1">
+      <w:start w:val="1"/>
+      <w:numFmt w:val="lowerRoman"/>
+      <w:lvlText w:val="%3."/>
+      <w:lvlJc w:val="right"/>
+      <w:pPr>
+        <w:ind w:left="2160" w:hanging="180"/>
+      </w:pPr>
+    </w:lvl>
+    <w:lvl w:ilvl="3" w:tplc="4009000F" w:tentative="1">
+      <w:start w:val="1"/>
+      <w:numFmt w:val="decimal"/>
+      <w:lvlText w:val="%4."/>
+      <w:lvlJc w:val="left"/>
+      <w:pPr>
+        <w:ind w:left="2880" w:hanging="360"/>
+      </w:pPr>
+    </w:lvl>
+    <w:lvl w:ilvl="4" w:tplc="40090019" w:tentative="1">
+      <w:start w:val="1"/>
+      <w:numFmt w:val="lowerLetter"/>
+      <w:lvlText w:val="%5."/>
+      <w:lvlJc w:val="left"/>
+      <w:pPr>
+        <w:ind w:left="3600" w:hanging="360"/>
+      </w:pPr>
+    </w:lvl>
+    <w:lvl w:ilvl="5" w:tplc="4009001B" w:tentative="1">
+      <w:start w:val="1"/>
+      <w:numFmt w:val="lowerRoman"/>
+      <w:lvlText w:val="%6."/>
+      <w:lvlJc w:val="right"/>
+      <w:pPr>
+        <w:ind w:left="4320" w:hanging="180"/>
+      </w:pPr>
+    </w:lvl>
+    <w:lvl w:ilvl="6" w:tplc="4009000F" w:tentative="1">
+      <w:start w:val="1"/>
+      <w:numFmt w:val="decimal"/>
+      <w:lvlText w:val="%7."/>
+      <w:lvlJc w:val="left"/>
+      <w:pPr>
+        <w:ind w:left="5040" w:hanging="360"/>
+      </w:pPr>
+    </w:lvl>
+    <w:lvl w:ilvl="7" w:tplc="40090019" w:tentative="1">
+      <w:start w:val="1"/>
+      <w:numFmt w:val="lowerLetter"/>
+      <w:lvlText w:val="%8."/>
+      <w:lvlJc w:val="left"/>
+      <w:pPr>
+        <w:ind w:left="5760" w:hanging="360"/>
+      </w:pPr>
+    </w:lvl>
+    <w:lvl w:ilvl="8" w:tplc="4009001B" w:tentative="1">
+      <w:start w:val="1"/>
+      <w:numFmt w:val="lowerRoman"/>
+      <w:lvlText w:val="%9."/>
+      <w:lvlJc w:val="right"/>
+      <w:pPr>
+        <w:ind w:left="6480" w:hanging="180"/>
+      </w:pPr>
+    </w:lvl>
+  </w:abstractNum>
+  <w:abstractNum w:abstractNumId="1" w15:restartNumberingAfterBreak="0">
     <w:nsid w:val="29A85E00"/>
     <w:multiLevelType w:val="multilevel"/>
     <w:tmpl w:val="EC144E88"/>
@@ -365,109 +1327,335 @@
       <w:lvlJc w:val="left"/>
       <w:pPr>
         <w:tabs>
-          <w:tab w:val="num" w:pos="720"/>
-        </w:tabs>
-        <w:ind w:left="720" w:hanging="360"/>
-      </w:pPr>
-    </w:lvl>
-    <w:lvl w:ilvl="1" w:tentative="1">
+          <w:tab w:val="num" w:pos="1080"/>
+        </w:tabs>
+        <w:ind w:left="1080" w:hanging="360"/>
+      </w:pPr>
+    </w:lvl>
+    <w:lvl w:ilvl="1">
       <w:start w:val="1"/>
       <w:numFmt w:val="decimal"/>
       <w:lvlText w:val="%2."/>
       <w:lvlJc w:val="left"/>
       <w:pPr>
         <w:tabs>
-          <w:tab w:val="num" w:pos="1440"/>
-        </w:tabs>
-        <w:ind w:left="1440" w:hanging="360"/>
-      </w:pPr>
-    </w:lvl>
-    <w:lvl w:ilvl="2" w:tentative="1">
+          <w:tab w:val="num" w:pos="1800"/>
+        </w:tabs>
+        <w:ind w:left="1800" w:hanging="360"/>
+      </w:pPr>
+    </w:lvl>
+    <w:lvl w:ilvl="2">
       <w:start w:val="1"/>
       <w:numFmt w:val="decimal"/>
       <w:lvlText w:val="%3."/>
       <w:lvlJc w:val="left"/>
       <w:pPr>
         <w:tabs>
-          <w:tab w:val="num" w:pos="2160"/>
-        </w:tabs>
-        <w:ind w:left="2160" w:hanging="360"/>
-      </w:pPr>
-    </w:lvl>
-    <w:lvl w:ilvl="3" w:tentative="1">
+          <w:tab w:val="num" w:pos="2520"/>
+        </w:tabs>
+        <w:ind w:left="2520" w:hanging="360"/>
+      </w:pPr>
+    </w:lvl>
+    <w:lvl w:ilvl="3">
       <w:start w:val="1"/>
       <w:numFmt w:val="decimal"/>
       <w:lvlText w:val="%4."/>
       <w:lvlJc w:val="left"/>
       <w:pPr>
         <w:tabs>
-          <w:tab w:val="num" w:pos="2880"/>
-        </w:tabs>
-        <w:ind w:left="2880" w:hanging="360"/>
-      </w:pPr>
-    </w:lvl>
-    <w:lvl w:ilvl="4" w:tentative="1">
+          <w:tab w:val="num" w:pos="3240"/>
+        </w:tabs>
+        <w:ind w:left="3240" w:hanging="360"/>
+      </w:pPr>
+    </w:lvl>
+    <w:lvl w:ilvl="4">
       <w:start w:val="1"/>
       <w:numFmt w:val="decimal"/>
       <w:lvlText w:val="%5."/>
       <w:lvlJc w:val="left"/>
       <w:pPr>
         <w:tabs>
-          <w:tab w:val="num" w:pos="3600"/>
-        </w:tabs>
-        <w:ind w:left="3600" w:hanging="360"/>
-      </w:pPr>
-    </w:lvl>
-    <w:lvl w:ilvl="5" w:tentative="1">
+          <w:tab w:val="num" w:pos="3960"/>
+        </w:tabs>
+        <w:ind w:left="3960" w:hanging="360"/>
+      </w:pPr>
+    </w:lvl>
+    <w:lvl w:ilvl="5">
       <w:start w:val="1"/>
       <w:numFmt w:val="decimal"/>
       <w:lvlText w:val="%6."/>
       <w:lvlJc w:val="left"/>
       <w:pPr>
         <w:tabs>
-          <w:tab w:val="num" w:pos="4320"/>
-        </w:tabs>
-        <w:ind w:left="4320" w:hanging="360"/>
-      </w:pPr>
-    </w:lvl>
-    <w:lvl w:ilvl="6" w:tentative="1">
+          <w:tab w:val="num" w:pos="4680"/>
+        </w:tabs>
+        <w:ind w:left="4680" w:hanging="360"/>
+      </w:pPr>
+    </w:lvl>
+    <w:lvl w:ilvl="6">
       <w:start w:val="1"/>
       <w:numFmt w:val="decimal"/>
       <w:lvlText w:val="%7."/>
       <w:lvlJc w:val="left"/>
       <w:pPr>
         <w:tabs>
-          <w:tab w:val="num" w:pos="5040"/>
-        </w:tabs>
-        <w:ind w:left="5040" w:hanging="360"/>
-      </w:pPr>
-    </w:lvl>
-    <w:lvl w:ilvl="7" w:tentative="1">
+          <w:tab w:val="num" w:pos="5400"/>
+        </w:tabs>
+        <w:ind w:left="5400" w:hanging="360"/>
+      </w:pPr>
+    </w:lvl>
+    <w:lvl w:ilvl="7">
       <w:start w:val="1"/>
       <w:numFmt w:val="decimal"/>
       <w:lvlText w:val="%8."/>
       <w:lvlJc w:val="left"/>
       <w:pPr>
         <w:tabs>
-          <w:tab w:val="num" w:pos="5760"/>
-        </w:tabs>
-        <w:ind w:left="5760" w:hanging="360"/>
-      </w:pPr>
-    </w:lvl>
-    <w:lvl w:ilvl="8" w:tentative="1">
+          <w:tab w:val="num" w:pos="6120"/>
+        </w:tabs>
+        <w:ind w:left="6120" w:hanging="360"/>
+      </w:pPr>
+    </w:lvl>
+    <w:lvl w:ilvl="8">
       <w:start w:val="1"/>
       <w:numFmt w:val="decimal"/>
       <w:lvlText w:val="%9."/>
       <w:lvlJc w:val="left"/>
       <w:pPr>
         <w:tabs>
-          <w:tab w:val="num" w:pos="6480"/>
-        </w:tabs>
+          <w:tab w:val="num" w:pos="6840"/>
+        </w:tabs>
+        <w:ind w:left="6840" w:hanging="360"/>
+      </w:pPr>
+    </w:lvl>
+  </w:abstractNum>
+  <w:abstractNum w:abstractNumId="2" w15:restartNumberingAfterBreak="0">
+    <w:nsid w:val="3E190E4B"/>
+    <w:multiLevelType w:val="hybridMultilevel"/>
+    <w:tmpl w:val="9A74E23C"/>
+    <w:lvl w:ilvl="0" w:tplc="40090001">
+      <w:start w:val="1"/>
+      <w:numFmt w:val="bullet"/>
+      <w:lvlText w:val=""/>
+      <w:lvlJc w:val="left"/>
+      <w:pPr>
+        <w:ind w:left="1440" w:hanging="360"/>
+      </w:pPr>
+      <w:rPr>
+        <w:rFonts w:ascii="Symbol" w:hAnsi="Symbol" w:hint="default"/>
+      </w:rPr>
+    </w:lvl>
+    <w:lvl w:ilvl="1" w:tplc="40090003" w:tentative="1">
+      <w:start w:val="1"/>
+      <w:numFmt w:val="bullet"/>
+      <w:lvlText w:val="o"/>
+      <w:lvlJc w:val="left"/>
+      <w:pPr>
+        <w:ind w:left="2160" w:hanging="360"/>
+      </w:pPr>
+      <w:rPr>
+        <w:rFonts w:ascii="Courier New" w:hAnsi="Courier New" w:cs="Courier New" w:hint="default"/>
+      </w:rPr>
+    </w:lvl>
+    <w:lvl w:ilvl="2" w:tplc="40090005" w:tentative="1">
+      <w:start w:val="1"/>
+      <w:numFmt w:val="bullet"/>
+      <w:lvlText w:val=""/>
+      <w:lvlJc w:val="left"/>
+      <w:pPr>
+        <w:ind w:left="2880" w:hanging="360"/>
+      </w:pPr>
+      <w:rPr>
+        <w:rFonts w:ascii="Wingdings" w:hAnsi="Wingdings" w:hint="default"/>
+      </w:rPr>
+    </w:lvl>
+    <w:lvl w:ilvl="3" w:tplc="40090001" w:tentative="1">
+      <w:start w:val="1"/>
+      <w:numFmt w:val="bullet"/>
+      <w:lvlText w:val=""/>
+      <w:lvlJc w:val="left"/>
+      <w:pPr>
+        <w:ind w:left="3600" w:hanging="360"/>
+      </w:pPr>
+      <w:rPr>
+        <w:rFonts w:ascii="Symbol" w:hAnsi="Symbol" w:hint="default"/>
+      </w:rPr>
+    </w:lvl>
+    <w:lvl w:ilvl="4" w:tplc="40090003" w:tentative="1">
+      <w:start w:val="1"/>
+      <w:numFmt w:val="bullet"/>
+      <w:lvlText w:val="o"/>
+      <w:lvlJc w:val="left"/>
+      <w:pPr>
+        <w:ind w:left="4320" w:hanging="360"/>
+      </w:pPr>
+      <w:rPr>
+        <w:rFonts w:ascii="Courier New" w:hAnsi="Courier New" w:cs="Courier New" w:hint="default"/>
+      </w:rPr>
+    </w:lvl>
+    <w:lvl w:ilvl="5" w:tplc="40090005" w:tentative="1">
+      <w:start w:val="1"/>
+      <w:numFmt w:val="bullet"/>
+      <w:lvlText w:val=""/>
+      <w:lvlJc w:val="left"/>
+      <w:pPr>
+        <w:ind w:left="5040" w:hanging="360"/>
+      </w:pPr>
+      <w:rPr>
+        <w:rFonts w:ascii="Wingdings" w:hAnsi="Wingdings" w:hint="default"/>
+      </w:rPr>
+    </w:lvl>
+    <w:lvl w:ilvl="6" w:tplc="40090001" w:tentative="1">
+      <w:start w:val="1"/>
+      <w:numFmt w:val="bullet"/>
+      <w:lvlText w:val=""/>
+      <w:lvlJc w:val="left"/>
+      <w:pPr>
+        <w:ind w:left="5760" w:hanging="360"/>
+      </w:pPr>
+      <w:rPr>
+        <w:rFonts w:ascii="Symbol" w:hAnsi="Symbol" w:hint="default"/>
+      </w:rPr>
+    </w:lvl>
+    <w:lvl w:ilvl="7" w:tplc="40090003" w:tentative="1">
+      <w:start w:val="1"/>
+      <w:numFmt w:val="bullet"/>
+      <w:lvlText w:val="o"/>
+      <w:lvlJc w:val="left"/>
+      <w:pPr>
         <w:ind w:left="6480" w:hanging="360"/>
       </w:pPr>
+      <w:rPr>
+        <w:rFonts w:ascii="Courier New" w:hAnsi="Courier New" w:cs="Courier New" w:hint="default"/>
+      </w:rPr>
+    </w:lvl>
+    <w:lvl w:ilvl="8" w:tplc="40090005" w:tentative="1">
+      <w:start w:val="1"/>
+      <w:numFmt w:val="bullet"/>
+      <w:lvlText w:val=""/>
+      <w:lvlJc w:val="left"/>
+      <w:pPr>
+        <w:ind w:left="7200" w:hanging="360"/>
+      </w:pPr>
+      <w:rPr>
+        <w:rFonts w:ascii="Wingdings" w:hAnsi="Wingdings" w:hint="default"/>
+      </w:rPr>
     </w:lvl>
   </w:abstractNum>
-  <w:abstractNum w:abstractNumId="1" w15:restartNumberingAfterBreak="0">
+  <w:abstractNum w:abstractNumId="3" w15:restartNumberingAfterBreak="0">
+    <w:nsid w:val="47124486"/>
+    <w:multiLevelType w:val="hybridMultilevel"/>
+    <w:tmpl w:val="2826866A"/>
+    <w:lvl w:ilvl="0" w:tplc="40090001">
+      <w:start w:val="1"/>
+      <w:numFmt w:val="bullet"/>
+      <w:lvlText w:val=""/>
+      <w:lvlJc w:val="left"/>
+      <w:pPr>
+        <w:ind w:left="1080" w:hanging="360"/>
+      </w:pPr>
+      <w:rPr>
+        <w:rFonts w:ascii="Symbol" w:hAnsi="Symbol" w:hint="default"/>
+      </w:rPr>
+    </w:lvl>
+    <w:lvl w:ilvl="1" w:tplc="40090003" w:tentative="1">
+      <w:start w:val="1"/>
+      <w:numFmt w:val="bullet"/>
+      <w:lvlText w:val="o"/>
+      <w:lvlJc w:val="left"/>
+      <w:pPr>
+        <w:ind w:left="1800" w:hanging="360"/>
+      </w:pPr>
+      <w:rPr>
+        <w:rFonts w:ascii="Courier New" w:hAnsi="Courier New" w:cs="Courier New" w:hint="default"/>
+      </w:rPr>
+    </w:lvl>
+    <w:lvl w:ilvl="2" w:tplc="40090005" w:tentative="1">
+      <w:start w:val="1"/>
+      <w:numFmt w:val="bullet"/>
+      <w:lvlText w:val=""/>
+      <w:lvlJc w:val="left"/>
+      <w:pPr>
+        <w:ind w:left="2520" w:hanging="360"/>
+      </w:pPr>
+      <w:rPr>
+        <w:rFonts w:ascii="Wingdings" w:hAnsi="Wingdings" w:hint="default"/>
+      </w:rPr>
+    </w:lvl>
+    <w:lvl w:ilvl="3" w:tplc="40090001" w:tentative="1">
+      <w:start w:val="1"/>
+      <w:numFmt w:val="bullet"/>
+      <w:lvlText w:val=""/>
+      <w:lvlJc w:val="left"/>
+      <w:pPr>
+        <w:ind w:left="3240" w:hanging="360"/>
+      </w:pPr>
+      <w:rPr>
+        <w:rFonts w:ascii="Symbol" w:hAnsi="Symbol" w:hint="default"/>
+      </w:rPr>
+    </w:lvl>
+    <w:lvl w:ilvl="4" w:tplc="40090003" w:tentative="1">
+      <w:start w:val="1"/>
+      <w:numFmt w:val="bullet"/>
+      <w:lvlText w:val="o"/>
+      <w:lvlJc w:val="left"/>
+      <w:pPr>
+        <w:ind w:left="3960" w:hanging="360"/>
+      </w:pPr>
+      <w:rPr>
+        <w:rFonts w:ascii="Courier New" w:hAnsi="Courier New" w:cs="Courier New" w:hint="default"/>
+      </w:rPr>
+    </w:lvl>
+    <w:lvl w:ilvl="5" w:tplc="40090005" w:tentative="1">
+      <w:start w:val="1"/>
+      <w:numFmt w:val="bullet"/>
+      <w:lvlText w:val=""/>
+      <w:lvlJc w:val="left"/>
+      <w:pPr>
+        <w:ind w:left="4680" w:hanging="360"/>
+      </w:pPr>
+      <w:rPr>
+        <w:rFonts w:ascii="Wingdings" w:hAnsi="Wingdings" w:hint="default"/>
+      </w:rPr>
+    </w:lvl>
+    <w:lvl w:ilvl="6" w:tplc="40090001" w:tentative="1">
+      <w:start w:val="1"/>
+      <w:numFmt w:val="bullet"/>
+      <w:lvlText w:val=""/>
+      <w:lvlJc w:val="left"/>
+      <w:pPr>
+        <w:ind w:left="5400" w:hanging="360"/>
+      </w:pPr>
+      <w:rPr>
+        <w:rFonts w:ascii="Symbol" w:hAnsi="Symbol" w:hint="default"/>
+      </w:rPr>
+    </w:lvl>
+    <w:lvl w:ilvl="7" w:tplc="40090003" w:tentative="1">
+      <w:start w:val="1"/>
+      <w:numFmt w:val="bullet"/>
+      <w:lvlText w:val="o"/>
+      <w:lvlJc w:val="left"/>
+      <w:pPr>
+        <w:ind w:left="6120" w:hanging="360"/>
+      </w:pPr>
+      <w:rPr>
+        <w:rFonts w:ascii="Courier New" w:hAnsi="Courier New" w:cs="Courier New" w:hint="default"/>
+      </w:rPr>
+    </w:lvl>
+    <w:lvl w:ilvl="8" w:tplc="40090005" w:tentative="1">
+      <w:start w:val="1"/>
+      <w:numFmt w:val="bullet"/>
+      <w:lvlText w:val=""/>
+      <w:lvlJc w:val="left"/>
+      <w:pPr>
+        <w:ind w:left="6840" w:hanging="360"/>
+      </w:pPr>
+      <w:rPr>
+        <w:rFonts w:ascii="Wingdings" w:hAnsi="Wingdings" w:hint="default"/>
+      </w:rPr>
+    </w:lvl>
+  </w:abstractNum>
+  <w:abstractNum w:abstractNumId="4" w15:restartNumberingAfterBreak="0">
     <w:nsid w:val="4F791F12"/>
     <w:multiLevelType w:val="multilevel"/>
     <w:tmpl w:val="380CB51E"/>
@@ -616,7 +1804,7 @@
       </w:rPr>
     </w:lvl>
   </w:abstractNum>
-  <w:abstractNum w:abstractNumId="2" w15:restartNumberingAfterBreak="0">
+  <w:abstractNum w:abstractNumId="5" w15:restartNumberingAfterBreak="0">
     <w:nsid w:val="676C73F5"/>
     <w:multiLevelType w:val="multilevel"/>
     <w:tmpl w:val="9D928F7E"/>
@@ -765,7 +1953,7 @@
       </w:rPr>
     </w:lvl>
   </w:abstractNum>
-  <w:abstractNum w:abstractNumId="3" w15:restartNumberingAfterBreak="0">
+  <w:abstractNum w:abstractNumId="6" w15:restartNumberingAfterBreak="0">
     <w:nsid w:val="7C6A3871"/>
     <w:multiLevelType w:val="multilevel"/>
     <w:tmpl w:val="1E422B84"/>
@@ -776,9 +1964,9 @@
       <w:lvlJc w:val="left"/>
       <w:pPr>
         <w:tabs>
-          <w:tab w:val="num" w:pos="720"/>
-        </w:tabs>
-        <w:ind w:left="720" w:hanging="360"/>
+          <w:tab w:val="num" w:pos="1080"/>
+        </w:tabs>
+        <w:ind w:left="1080" w:hanging="360"/>
       </w:pPr>
       <w:rPr>
         <w:rFonts w:ascii="Symbol" w:hAnsi="Symbol" w:hint="default"/>
@@ -792,9 +1980,9 @@
       <w:lvlJc w:val="left"/>
       <w:pPr>
         <w:tabs>
-          <w:tab w:val="num" w:pos="1440"/>
-        </w:tabs>
-        <w:ind w:left="1440" w:hanging="360"/>
+          <w:tab w:val="num" w:pos="1800"/>
+        </w:tabs>
+        <w:ind w:left="1800" w:hanging="360"/>
       </w:pPr>
       <w:rPr>
         <w:rFonts w:ascii="Courier New" w:hAnsi="Courier New" w:hint="default"/>
@@ -808,9 +1996,9 @@
       <w:lvlJc w:val="left"/>
       <w:pPr>
         <w:tabs>
-          <w:tab w:val="num" w:pos="2160"/>
-        </w:tabs>
-        <w:ind w:left="2160" w:hanging="360"/>
+          <w:tab w:val="num" w:pos="2520"/>
+        </w:tabs>
+        <w:ind w:left="2520" w:hanging="360"/>
       </w:pPr>
       <w:rPr>
         <w:rFonts w:ascii="Wingdings" w:hAnsi="Wingdings" w:hint="default"/>
@@ -824,9 +2012,9 @@
       <w:lvlJc w:val="left"/>
       <w:pPr>
         <w:tabs>
-          <w:tab w:val="num" w:pos="2880"/>
-        </w:tabs>
-        <w:ind w:left="2880" w:hanging="360"/>
+          <w:tab w:val="num" w:pos="3240"/>
+        </w:tabs>
+        <w:ind w:left="3240" w:hanging="360"/>
       </w:pPr>
       <w:rPr>
         <w:rFonts w:ascii="Wingdings" w:hAnsi="Wingdings" w:hint="default"/>
@@ -840,9 +2028,9 @@
       <w:lvlJc w:val="left"/>
       <w:pPr>
         <w:tabs>
-          <w:tab w:val="num" w:pos="3600"/>
-        </w:tabs>
-        <w:ind w:left="3600" w:hanging="360"/>
+          <w:tab w:val="num" w:pos="3960"/>
+        </w:tabs>
+        <w:ind w:left="3960" w:hanging="360"/>
       </w:pPr>
       <w:rPr>
         <w:rFonts w:ascii="Wingdings" w:hAnsi="Wingdings" w:hint="default"/>
@@ -856,9 +2044,9 @@
       <w:lvlJc w:val="left"/>
       <w:pPr>
         <w:tabs>
-          <w:tab w:val="num" w:pos="4320"/>
-        </w:tabs>
-        <w:ind w:left="4320" w:hanging="360"/>
+          <w:tab w:val="num" w:pos="4680"/>
+        </w:tabs>
+        <w:ind w:left="4680" w:hanging="360"/>
       </w:pPr>
       <w:rPr>
         <w:rFonts w:ascii="Wingdings" w:hAnsi="Wingdings" w:hint="default"/>
@@ -872,9 +2060,9 @@
       <w:lvlJc w:val="left"/>
       <w:pPr>
         <w:tabs>
-          <w:tab w:val="num" w:pos="5040"/>
-        </w:tabs>
-        <w:ind w:left="5040" w:hanging="360"/>
+          <w:tab w:val="num" w:pos="5400"/>
+        </w:tabs>
+        <w:ind w:left="5400" w:hanging="360"/>
       </w:pPr>
       <w:rPr>
         <w:rFonts w:ascii="Wingdings" w:hAnsi="Wingdings" w:hint="default"/>
@@ -888,9 +2076,9 @@
       <w:lvlJc w:val="left"/>
       <w:pPr>
         <w:tabs>
-          <w:tab w:val="num" w:pos="5760"/>
-        </w:tabs>
-        <w:ind w:left="5760" w:hanging="360"/>
+          <w:tab w:val="num" w:pos="6120"/>
+        </w:tabs>
+        <w:ind w:left="6120" w:hanging="360"/>
       </w:pPr>
       <w:rPr>
         <w:rFonts w:ascii="Wingdings" w:hAnsi="Wingdings" w:hint="default"/>
@@ -904,9 +2092,9 @@
       <w:lvlJc w:val="left"/>
       <w:pPr>
         <w:tabs>
-          <w:tab w:val="num" w:pos="6480"/>
-        </w:tabs>
-        <w:ind w:left="6480" w:hanging="360"/>
+          <w:tab w:val="num" w:pos="6840"/>
+        </w:tabs>
+        <w:ind w:left="6840" w:hanging="360"/>
       </w:pPr>
       <w:rPr>
         <w:rFonts w:ascii="Wingdings" w:hAnsi="Wingdings" w:hint="default"/>
@@ -915,16 +2103,25 @@
     </w:lvl>
   </w:abstractNum>
   <w:num w:numId="1" w16cid:durableId="1695614429">
-    <w:abstractNumId w:val="3"/>
+    <w:abstractNumId w:val="6"/>
   </w:num>
   <w:num w:numId="2" w16cid:durableId="578903568">
+    <w:abstractNumId w:val="1"/>
+  </w:num>
+  <w:num w:numId="3" w16cid:durableId="2009937639">
+    <w:abstractNumId w:val="4"/>
+  </w:num>
+  <w:num w:numId="4" w16cid:durableId="923101656">
+    <w:abstractNumId w:val="5"/>
+  </w:num>
+  <w:num w:numId="5" w16cid:durableId="1197356953">
     <w:abstractNumId w:val="0"/>
   </w:num>
-  <w:num w:numId="3" w16cid:durableId="2009937639">
-    <w:abstractNumId w:val="1"/>
+  <w:num w:numId="6" w16cid:durableId="1684359047">
+    <w:abstractNumId w:val="2"/>
   </w:num>
-  <w:num w:numId="4" w16cid:durableId="923101656">
-    <w:abstractNumId w:val="2"/>
+  <w:num w:numId="7" w16cid:durableId="1421948112">
+    <w:abstractNumId w:val="3"/>
   </w:num>
 </w:numbering>
 </file>
@@ -1845,6 +3042,66 @@
       <w:spacing w:val="5"/>
     </w:rPr>
   </w:style>
+  <w:style w:type="character" w:styleId="Strong">
+    <w:name w:val="Strong"/>
+    <w:basedOn w:val="DefaultParagraphFont"/>
+    <w:uiPriority w:val="22"/>
+    <w:qFormat/>
+    <w:rsid w:val="00170374"/>
+    <w:rPr>
+      <w:b/>
+      <w:bCs/>
+    </w:rPr>
+  </w:style>
+  <w:style w:type="character" w:styleId="SubtleEmphasis">
+    <w:name w:val="Subtle Emphasis"/>
+    <w:basedOn w:val="DefaultParagraphFont"/>
+    <w:uiPriority w:val="19"/>
+    <w:qFormat/>
+    <w:rsid w:val="00170374"/>
+    <w:rPr>
+      <w:i/>
+      <w:iCs/>
+      <w:color w:val="404040" w:themeColor="text1" w:themeTint="BF"/>
+    </w:rPr>
+  </w:style>
+  <w:style w:type="character" w:styleId="BookTitle">
+    <w:name w:val="Book Title"/>
+    <w:basedOn w:val="DefaultParagraphFont"/>
+    <w:uiPriority w:val="33"/>
+    <w:qFormat/>
+    <w:rsid w:val="00170374"/>
+    <w:rPr>
+      <w:b/>
+      <w:bCs/>
+      <w:i/>
+      <w:iCs/>
+      <w:spacing w:val="5"/>
+    </w:rPr>
+  </w:style>
+  <w:style w:type="character" w:styleId="Hyperlink">
+    <w:name w:val="Hyperlink"/>
+    <w:basedOn w:val="DefaultParagraphFont"/>
+    <w:uiPriority w:val="99"/>
+    <w:unhideWhenUsed/>
+    <w:rsid w:val="00AC4C0F"/>
+    <w:rPr>
+      <w:color w:val="0563C1" w:themeColor="hyperlink"/>
+      <w:u w:val="single"/>
+    </w:rPr>
+  </w:style>
+  <w:style w:type="character" w:styleId="UnresolvedMention">
+    <w:name w:val="Unresolved Mention"/>
+    <w:basedOn w:val="DefaultParagraphFont"/>
+    <w:uiPriority w:val="99"/>
+    <w:semiHidden/>
+    <w:unhideWhenUsed/>
+    <w:rsid w:val="00AC4C0F"/>
+    <w:rPr>
+      <w:color w:val="605E5C"/>
+      <w:shd w:val="clear" w:color="auto" w:fill="E1DFDD"/>
+    </w:rPr>
+  </w:style>
 </w:styles>
 </file>
 

</xml_diff>